<commit_message>
code reports white theme
</commit_message>
<xml_diff>
--- a/Отчет по УП.docx
+++ b/Отчет по УП.docx
@@ -134,7 +134,27 @@
                 <w:sz w:val="16"/>
                 <w:szCs w:val="24"/>
               </w:rPr>
-              <w:t>199155, Санкт-Петербург, наб. реки Смоленки, д.1</w:t>
+              <w:t xml:space="preserve">199155, Санкт-Петербург, наб. реки </w:t>
+            </w:r>
+            <w:proofErr w:type="spellStart"/>
+            <w:r>
+              <w:rPr>
+                <w:rFonts w:ascii="Times New Roman" w:hAnsi="Times New Roman" w:cs="Times New Roman"/>
+                <w:color w:val="000000"/>
+                <w:sz w:val="16"/>
+                <w:szCs w:val="24"/>
+              </w:rPr>
+              <w:t>Смоленки</w:t>
+            </w:r>
+            <w:proofErr w:type="spellEnd"/>
+            <w:r>
+              <w:rPr>
+                <w:rFonts w:ascii="Times New Roman" w:hAnsi="Times New Roman" w:cs="Times New Roman"/>
+                <w:color w:val="000000"/>
+                <w:sz w:val="16"/>
+                <w:szCs w:val="24"/>
+              </w:rPr>
+              <w:t>, д.1</w:t>
             </w:r>
           </w:p>
           <w:p>
@@ -171,8 +191,19 @@
                 <w:sz w:val="16"/>
                 <w:szCs w:val="24"/>
               </w:rPr>
-              <w:t xml:space="preserve"> e-mail</w:t>
+              <w:t xml:space="preserve"> e-</w:t>
             </w:r>
+            <w:proofErr w:type="spellStart"/>
+            <w:r>
+              <w:rPr>
+                <w:rFonts w:ascii="Times New Roman" w:hAnsi="Times New Roman" w:cs="Times New Roman"/>
+                <w:color w:val="000000"/>
+                <w:sz w:val="16"/>
+                <w:szCs w:val="24"/>
+              </w:rPr>
+              <w:t>mail</w:t>
+            </w:r>
+            <w:proofErr w:type="spellEnd"/>
             <w:r>
               <w:rPr>
                 <w:rFonts w:ascii="Times New Roman" w:hAnsi="Times New Roman" w:cs="Times New Roman"/>
@@ -181,6 +212,7 @@
               </w:rPr>
               <w:t xml:space="preserve">: </w:t>
             </w:r>
+            <w:proofErr w:type="spellStart"/>
             <w:r>
               <w:rPr>
                 <w:rFonts w:ascii="Times New Roman" w:hAnsi="Times New Roman" w:cs="Times New Roman"/>
@@ -190,6 +222,7 @@
               </w:rPr>
               <w:t>ksipt</w:t>
             </w:r>
+            <w:proofErr w:type="spellEnd"/>
             <w:r>
               <w:rPr>
                 <w:rFonts w:ascii="Times New Roman" w:hAnsi="Times New Roman" w:cs="Times New Roman"/>
@@ -198,6 +231,7 @@
               </w:rPr>
               <w:t>@</w:t>
             </w:r>
+            <w:proofErr w:type="spellStart"/>
             <w:r>
               <w:rPr>
                 <w:rFonts w:ascii="Times New Roman" w:hAnsi="Times New Roman" w:cs="Times New Roman"/>
@@ -207,6 +241,7 @@
               </w:rPr>
               <w:t>obr</w:t>
             </w:r>
+            <w:proofErr w:type="spellEnd"/>
             <w:r>
               <w:rPr>
                 <w:rFonts w:ascii="Times New Roman" w:hAnsi="Times New Roman" w:cs="Times New Roman"/>
@@ -215,6 +250,7 @@
               </w:rPr>
               <w:t>.</w:t>
             </w:r>
+            <w:proofErr w:type="spellStart"/>
             <w:r>
               <w:rPr>
                 <w:rFonts w:ascii="Times New Roman" w:hAnsi="Times New Roman" w:cs="Times New Roman"/>
@@ -224,6 +260,7 @@
               </w:rPr>
               <w:t>gov</w:t>
             </w:r>
+            <w:proofErr w:type="spellEnd"/>
             <w:r>
               <w:rPr>
                 <w:rFonts w:ascii="Times New Roman" w:hAnsi="Times New Roman" w:cs="Times New Roman"/>
@@ -232,6 +269,7 @@
               </w:rPr>
               <w:t>.</w:t>
             </w:r>
+            <w:proofErr w:type="spellStart"/>
             <w:r>
               <w:rPr>
                 <w:rFonts w:ascii="Times New Roman" w:hAnsi="Times New Roman" w:cs="Times New Roman"/>
@@ -241,14 +279,25 @@
               </w:rPr>
               <w:t>spb</w:t>
             </w:r>
+            <w:proofErr w:type="spellEnd"/>
             <w:r>
               <w:rPr>
                 <w:rFonts w:ascii="Times New Roman" w:hAnsi="Times New Roman" w:cs="Times New Roman"/>
                 <w:sz w:val="16"/>
                 <w:szCs w:val="24"/>
               </w:rPr>
-              <w:t>.ru</w:t>
+              <w:t>.</w:t>
             </w:r>
+            <w:proofErr w:type="spellStart"/>
+            <w:r>
+              <w:rPr>
+                <w:rFonts w:ascii="Times New Roman" w:hAnsi="Times New Roman" w:cs="Times New Roman"/>
+                <w:sz w:val="16"/>
+                <w:szCs w:val="24"/>
+              </w:rPr>
+              <w:t>ru</w:t>
+            </w:r>
+            <w:proofErr w:type="spellEnd"/>
           </w:p>
         </w:tc>
       </w:tr>
@@ -610,13 +659,23 @@
         </w:rPr>
         <w:t xml:space="preserve"> </w:t>
       </w:r>
+      <w:proofErr w:type="spellStart"/>
       <w:r>
         <w:rPr>
           <w:rFonts w:ascii="Times New Roman" w:hAnsi="Times New Roman" w:cs="Times New Roman"/>
           <w:sz w:val="40"/>
           <w:szCs w:val="40"/>
         </w:rPr>
-        <w:t>Коржев Андрей Артёмович</w:t>
+        <w:t>Коржев</w:t>
+      </w:r>
+      <w:proofErr w:type="spellEnd"/>
+      <w:r>
+        <w:rPr>
+          <w:rFonts w:ascii="Times New Roman" w:hAnsi="Times New Roman" w:cs="Times New Roman"/>
+          <w:sz w:val="40"/>
+          <w:szCs w:val="40"/>
+        </w:rPr>
+        <w:t xml:space="preserve"> Андрей Артёмович</w:t>
       </w:r>
     </w:p>
     <w:p>
@@ -1205,8 +1264,17 @@
           <w:rFonts w:ascii="Times New Roman" w:hAnsi="Times New Roman" w:cs="Times New Roman"/>
           <w:sz w:val="28"/>
         </w:rPr>
-        <w:t>практическая реализация создания разработка веб-приложения для обмена файлами между студентами и преподователями</w:t>
-      </w:r>
+        <w:t xml:space="preserve">практическая реализация создания разработка веб-приложения для обмена файлами между студентами и </w:t>
+      </w:r>
+      <w:proofErr w:type="spellStart"/>
+      <w:r>
+        <w:rPr>
+          <w:rFonts w:ascii="Times New Roman" w:hAnsi="Times New Roman" w:cs="Times New Roman"/>
+          <w:sz w:val="28"/>
+        </w:rPr>
+        <w:t>преподователями</w:t>
+      </w:r>
+      <w:proofErr w:type="spellEnd"/>
       <w:r>
         <w:rPr>
           <w:rFonts w:ascii="Times New Roman" w:hAnsi="Times New Roman" w:cs="Times New Roman"/>
@@ -1432,14 +1500,13 @@
         <w:t>Демонстрация реализации разработки базы данных проекта</w:t>
       </w:r>
     </w:p>
-    <w:p/>
     <w:p>
       <w:r>
         <w:drawing>
-          <wp:inline distT="0" distB="0" distL="0" distR="0" wp14:anchorId="0814BED0" wp14:editId="1EE8F932">
-            <wp:extent cx="5940425" cy="4635500"/>
+          <wp:inline distT="0" distB="0" distL="0" distR="0" wp14:anchorId="306F0D8B" wp14:editId="165B0620">
+            <wp:extent cx="5940425" cy="5029835"/>
             <wp:effectExtent l="0" t="0" r="3175" b="0"/>
-            <wp:docPr id="2" name="Рисунок 2"/>
+            <wp:docPr id="32" name="Рисунок 32"/>
             <wp:cNvGraphicFramePr>
               <a:graphicFrameLocks xmlns:a="http://schemas.openxmlformats.org/drawingml/2006/main" noChangeAspect="1"/>
             </wp:cNvGraphicFramePr>
@@ -1459,7 +1526,7 @@
                   <pic:spPr>
                     <a:xfrm>
                       <a:off x="0" y="0"/>
-                      <a:ext cx="5940425" cy="4635500"/>
+                      <a:ext cx="5940425" cy="5029835"/>
                     </a:xfrm>
                     <a:prstGeom prst="rect">
                       <a:avLst/>
@@ -1490,10 +1557,10 @@
       <w:r>
         <w:lastRenderedPageBreak/>
         <w:drawing>
-          <wp:inline distT="0" distB="0" distL="0" distR="0" wp14:anchorId="6AACBF84" wp14:editId="003C0851">
-            <wp:extent cx="5940425" cy="4626610"/>
-            <wp:effectExtent l="0" t="0" r="3175" b="2540"/>
-            <wp:docPr id="3" name="Рисунок 3"/>
+          <wp:inline distT="0" distB="0" distL="0" distR="0" wp14:anchorId="44690E61" wp14:editId="2039874A">
+            <wp:extent cx="5940425" cy="4558030"/>
+            <wp:effectExtent l="0" t="0" r="3175" b="0"/>
+            <wp:docPr id="33" name="Рисунок 33"/>
             <wp:cNvGraphicFramePr>
               <a:graphicFrameLocks xmlns:a="http://schemas.openxmlformats.org/drawingml/2006/main" noChangeAspect="1"/>
             </wp:cNvGraphicFramePr>
@@ -1513,7 +1580,7 @@
                   <pic:spPr>
                     <a:xfrm>
                       <a:off x="0" y="0"/>
-                      <a:ext cx="5940425" cy="4626610"/>
+                      <a:ext cx="5940425" cy="4558030"/>
                     </a:xfrm>
                     <a:prstGeom prst="rect">
                       <a:avLst/>
@@ -1535,10 +1602,10 @@
       <w:r>
         <w:lastRenderedPageBreak/>
         <w:drawing>
-          <wp:inline distT="0" distB="0" distL="0" distR="0" wp14:anchorId="1A17CB58" wp14:editId="1DE0A020">
-            <wp:extent cx="5940425" cy="4496435"/>
-            <wp:effectExtent l="0" t="0" r="3175" b="0"/>
-            <wp:docPr id="6" name="Рисунок 6"/>
+          <wp:inline distT="0" distB="0" distL="0" distR="0" wp14:anchorId="425576F9" wp14:editId="5553E648">
+            <wp:extent cx="5940425" cy="4505325"/>
+            <wp:effectExtent l="0" t="0" r="3175" b="9525"/>
+            <wp:docPr id="37" name="Рисунок 37"/>
             <wp:cNvGraphicFramePr>
               <a:graphicFrameLocks xmlns:a="http://schemas.openxmlformats.org/drawingml/2006/main" noChangeAspect="1"/>
             </wp:cNvGraphicFramePr>
@@ -1558,7 +1625,7 @@
                   <pic:spPr>
                     <a:xfrm>
                       <a:off x="0" y="0"/>
-                      <a:ext cx="5940425" cy="4496435"/>
+                      <a:ext cx="5940425" cy="4505325"/>
                     </a:xfrm>
                     <a:prstGeom prst="rect">
                       <a:avLst/>
@@ -1573,18 +1640,19 @@
     </w:p>
     <w:p>
       <w:r>
-        <w:t>Демонстрация кода вида фильтра страницы с пользователями</w:t>
-      </w:r>
-    </w:p>
+        <w:t>Демонстрация кода фильтра страницы с пользователями</w:t>
+      </w:r>
+    </w:p>
+    <w:p/>
     <w:p/>
     <w:p>
       <w:r>
         <w:lastRenderedPageBreak/>
         <w:drawing>
-          <wp:inline distT="0" distB="0" distL="0" distR="0" wp14:anchorId="4D6BB376" wp14:editId="37D09EFE">
-            <wp:extent cx="5940425" cy="3993515"/>
-            <wp:effectExtent l="0" t="0" r="3175" b="6985"/>
-            <wp:docPr id="7" name="Рисунок 7"/>
+          <wp:inline distT="0" distB="0" distL="0" distR="0" wp14:anchorId="692B374C" wp14:editId="73D7A439">
+            <wp:extent cx="5940425" cy="4323715"/>
+            <wp:effectExtent l="0" t="0" r="3175" b="635"/>
+            <wp:docPr id="36" name="Рисунок 36"/>
             <wp:cNvGraphicFramePr>
               <a:graphicFrameLocks xmlns:a="http://schemas.openxmlformats.org/drawingml/2006/main" noChangeAspect="1"/>
             </wp:cNvGraphicFramePr>
@@ -1604,7 +1672,7 @@
                   <pic:spPr>
                     <a:xfrm>
                       <a:off x="0" y="0"/>
-                      <a:ext cx="5940425" cy="3993515"/>
+                      <a:ext cx="5940425" cy="4323715"/>
                     </a:xfrm>
                     <a:prstGeom prst="rect">
                       <a:avLst/>
@@ -1625,12 +1693,11 @@
     <w:p/>
     <w:p>
       <w:r>
-        <w:lastRenderedPageBreak/>
         <w:drawing>
-          <wp:inline distT="0" distB="0" distL="0" distR="0" wp14:anchorId="59704A0B" wp14:editId="43D564AF">
-            <wp:extent cx="5940425" cy="4495800"/>
+          <wp:inline distT="0" distB="0" distL="0" distR="0" wp14:anchorId="53F20041" wp14:editId="3AE46933">
+            <wp:extent cx="5940425" cy="3905885"/>
             <wp:effectExtent l="0" t="0" r="3175" b="0"/>
-            <wp:docPr id="8" name="Рисунок 8"/>
+            <wp:docPr id="38" name="Рисунок 38"/>
             <wp:cNvGraphicFramePr>
               <a:graphicFrameLocks xmlns:a="http://schemas.openxmlformats.org/drawingml/2006/main" noChangeAspect="1"/>
             </wp:cNvGraphicFramePr>
@@ -1650,7 +1717,7 @@
                   <pic:spPr>
                     <a:xfrm>
                       <a:off x="0" y="0"/>
-                      <a:ext cx="5940425" cy="4495800"/>
+                      <a:ext cx="5940425" cy="3905885"/>
                     </a:xfrm>
                     <a:prstGeom prst="rect">
                       <a:avLst/>
@@ -1665,16 +1732,18 @@
     </w:p>
     <w:p>
       <w:r>
+        <w:lastRenderedPageBreak/>
         <w:t>Демонстрация реализации контроллера страницы квалификаций</w:t>
       </w:r>
     </w:p>
     <w:p>
+      <w:bookmarkStart w:id="2" w:name="_GoBack"/>
       <w:r>
         <w:drawing>
-          <wp:inline distT="0" distB="0" distL="0" distR="0" wp14:anchorId="6C845B7F" wp14:editId="2CB713BE">
-            <wp:extent cx="5772956" cy="2686425"/>
-            <wp:effectExtent l="0" t="0" r="0" b="0"/>
-            <wp:docPr id="9" name="Рисунок 9"/>
+          <wp:inline distT="0" distB="0" distL="0" distR="0" wp14:anchorId="041274B3" wp14:editId="6DDB3130">
+            <wp:extent cx="5940425" cy="2210435"/>
+            <wp:effectExtent l="0" t="0" r="3175" b="0"/>
+            <wp:docPr id="39" name="Рисунок 39"/>
             <wp:cNvGraphicFramePr>
               <a:graphicFrameLocks xmlns:a="http://schemas.openxmlformats.org/drawingml/2006/main" noChangeAspect="1"/>
             </wp:cNvGraphicFramePr>
@@ -1694,7 +1763,7 @@
                   <pic:spPr>
                     <a:xfrm>
                       <a:off x="0" y="0"/>
-                      <a:ext cx="5772956" cy="2686425"/>
+                      <a:ext cx="5940425" cy="2210435"/>
                     </a:xfrm>
                     <a:prstGeom prst="rect">
                       <a:avLst/>
@@ -1706,6 +1775,7 @@
           </wp:inline>
         </w:drawing>
       </w:r>
+      <w:bookmarkEnd w:id="2"/>
     </w:p>
     <w:p>
       <w:r>
@@ -1714,7 +1784,6 @@
     </w:p>
     <w:p>
       <w:r>
-        <w:lastRenderedPageBreak/>
         <w:drawing>
           <wp:inline distT="0" distB="0" distL="0" distR="0" wp14:anchorId="067D3C90" wp14:editId="0D89204E">
             <wp:extent cx="5940425" cy="2940685"/>
@@ -1759,6 +1828,7 @@
     </w:p>
     <w:p>
       <w:r>
+        <w:lastRenderedPageBreak/>
         <w:drawing>
           <wp:inline distT="0" distB="0" distL="0" distR="0" wp14:anchorId="60A90875" wp14:editId="4FB64C37">
             <wp:extent cx="5940425" cy="2938780"/>
@@ -1803,7 +1873,6 @@
     </w:p>
     <w:p>
       <w:r>
-        <w:lastRenderedPageBreak/>
         <w:drawing>
           <wp:inline distT="0" distB="0" distL="0" distR="0" wp14:anchorId="1F96C069" wp14:editId="75603B3B">
             <wp:extent cx="5940425" cy="2933065"/>
@@ -1848,6 +1917,7 @@
     </w:p>
     <w:p>
       <w:r>
+        <w:lastRenderedPageBreak/>
         <w:drawing>
           <wp:inline distT="0" distB="0" distL="0" distR="0" wp14:anchorId="07CD4464" wp14:editId="68C570D7">
             <wp:extent cx="5940425" cy="2936240"/>
@@ -1892,7 +1962,6 @@
     </w:p>
     <w:p>
       <w:r>
-        <w:lastRenderedPageBreak/>
         <w:drawing>
           <wp:inline distT="0" distB="0" distL="0" distR="0" wp14:anchorId="7986D100" wp14:editId="440CF897">
             <wp:extent cx="5940425" cy="2951480"/>
@@ -1937,6 +2006,7 @@
     </w:p>
     <w:p>
       <w:r>
+        <w:lastRenderedPageBreak/>
         <w:drawing>
           <wp:inline distT="0" distB="0" distL="0" distR="0" wp14:anchorId="40A9A1FB" wp14:editId="46B7EDF4">
             <wp:extent cx="5940425" cy="2929890"/>
@@ -1981,7 +2051,6 @@
     </w:p>
     <w:p>
       <w:r>
-        <w:lastRenderedPageBreak/>
         <w:drawing>
           <wp:inline distT="0" distB="0" distL="0" distR="0" wp14:anchorId="19308654" wp14:editId="759E1270">
             <wp:extent cx="5940425" cy="2945130"/>
@@ -2026,6 +2095,7 @@
     </w:p>
     <w:p>
       <w:r>
+        <w:lastRenderedPageBreak/>
         <w:drawing>
           <wp:inline distT="0" distB="0" distL="0" distR="0" wp14:anchorId="4C364F4B" wp14:editId="5A8CCCC8">
             <wp:extent cx="5940425" cy="2933065"/>
@@ -2070,7 +2140,6 @@
     </w:p>
     <w:p>
       <w:r>
-        <w:lastRenderedPageBreak/>
         <w:drawing>
           <wp:inline distT="0" distB="0" distL="0" distR="0" wp14:anchorId="6698FB02" wp14:editId="15E25A37">
             <wp:extent cx="5940425" cy="2933065"/>
@@ -2115,6 +2184,7 @@
     </w:p>
     <w:p>
       <w:r>
+        <w:lastRenderedPageBreak/>
         <w:drawing>
           <wp:inline distT="0" distB="0" distL="0" distR="0" wp14:anchorId="27ABA555" wp14:editId="7EF26DF0">
             <wp:extent cx="5940425" cy="2945130"/>
@@ -2159,7 +2229,6 @@
     </w:p>
     <w:p>
       <w:r>
-        <w:lastRenderedPageBreak/>
         <w:drawing>
           <wp:inline distT="0" distB="0" distL="0" distR="0" wp14:anchorId="35709C01" wp14:editId="3C1DAA1B">
             <wp:extent cx="5940425" cy="2933065"/>
@@ -2204,6 +2273,7 @@
     </w:p>
     <w:p>
       <w:r>
+        <w:lastRenderedPageBreak/>
         <w:drawing>
           <wp:inline distT="0" distB="0" distL="0" distR="0" wp14:anchorId="59139C2F" wp14:editId="605B90C3">
             <wp:extent cx="5940425" cy="2926715"/>
@@ -2248,7 +2318,6 @@
     </w:p>
     <w:p>
       <w:r>
-        <w:lastRenderedPageBreak/>
         <w:drawing>
           <wp:inline distT="0" distB="0" distL="0" distR="0" wp14:anchorId="33CD72F0" wp14:editId="6BBF42D1">
             <wp:extent cx="5940425" cy="2929890"/>
@@ -2293,6 +2362,7 @@
     </w:p>
     <w:p>
       <w:r>
+        <w:lastRenderedPageBreak/>
         <w:drawing>
           <wp:inline distT="0" distB="0" distL="0" distR="0" wp14:anchorId="23733FC4" wp14:editId="17621527">
             <wp:extent cx="5940425" cy="2933065"/>
@@ -2340,7 +2410,6 @@
     </w:p>
     <w:p>
       <w:r>
-        <w:lastRenderedPageBreak/>
         <w:drawing>
           <wp:inline distT="0" distB="0" distL="0" distR="0" wp14:anchorId="28D22F91" wp14:editId="2277A292">
             <wp:extent cx="5940425" cy="2933065"/>
@@ -2385,6 +2454,7 @@
     </w:p>
     <w:p>
       <w:r>
+        <w:lastRenderedPageBreak/>
         <w:drawing>
           <wp:inline distT="0" distB="0" distL="0" distR="0" wp14:anchorId="62A48D29" wp14:editId="5DC83ABB">
             <wp:extent cx="5940425" cy="2945130"/>
@@ -2429,7 +2499,6 @@
     </w:p>
     <w:p>
       <w:r>
-        <w:lastRenderedPageBreak/>
         <w:drawing>
           <wp:inline distT="0" distB="0" distL="0" distR="0" wp14:anchorId="6581F3CB" wp14:editId="4572A71C">
             <wp:extent cx="5940425" cy="2936240"/>
@@ -2469,11 +2538,17 @@
     </w:p>
     <w:p>
       <w:r>
-        <w:t>Демонстрация страница общего файлового хаба</w:t>
-      </w:r>
-    </w:p>
-    <w:p>
-      <w:r>
+        <w:t xml:space="preserve">Демонстрация страница общего файлового </w:t>
+      </w:r>
+      <w:proofErr w:type="spellStart"/>
+      <w:r>
+        <w:t>хаба</w:t>
+      </w:r>
+      <w:proofErr w:type="spellEnd"/>
+    </w:p>
+    <w:p>
+      <w:r>
+        <w:lastRenderedPageBreak/>
         <w:drawing>
           <wp:inline distT="0" distB="0" distL="0" distR="0" wp14:anchorId="5A81BA62" wp14:editId="3DD819F1">
             <wp:extent cx="5940425" cy="2933065"/>
@@ -2513,13 +2588,17 @@
     </w:p>
     <w:p>
       <w:r>
-        <w:t>Демонстрация просмотра выбранной папки файлового хаба</w:t>
-      </w:r>
+        <w:t xml:space="preserve">Демонстрация просмотра выбранной папки файлового </w:t>
+      </w:r>
+      <w:proofErr w:type="spellStart"/>
+      <w:r>
+        <w:t>хаба</w:t>
+      </w:r>
+      <w:proofErr w:type="spellEnd"/>
     </w:p>
     <w:p/>
     <w:p>
       <w:r>
-        <w:lastRenderedPageBreak/>
         <w:drawing>
           <wp:inline distT="0" distB="0" distL="0" distR="0" wp14:anchorId="26681250" wp14:editId="01933FCA">
             <wp:extent cx="5940425" cy="2929890"/>
@@ -2559,8 +2638,13 @@
     </w:p>
     <w:p>
       <w:r>
-        <w:t>Демонстрация страницы создания новой папки в файловом хабе</w:t>
-      </w:r>
+        <w:t xml:space="preserve">Демонстрация страницы создания новой папки в файловом </w:t>
+      </w:r>
+      <w:proofErr w:type="spellStart"/>
+      <w:r>
+        <w:t>хабе</w:t>
+      </w:r>
+      <w:proofErr w:type="spellEnd"/>
     </w:p>
     <w:p>
       <w:pPr>
@@ -2572,6 +2656,7 @@
         <w:rPr>
           <w:lang w:val="en-US"/>
         </w:rPr>
+        <w:lastRenderedPageBreak/>
         <w:drawing>
           <wp:inline distT="0" distB="0" distL="0" distR="0" wp14:anchorId="0902C8C1" wp14:editId="4ADC5993">
             <wp:extent cx="5940425" cy="2929890"/>
@@ -2616,7 +2701,6 @@
     </w:p>
     <w:p>
       <w:r>
-        <w:lastRenderedPageBreak/>
         <w:drawing>
           <wp:inline distT="0" distB="0" distL="0" distR="0" wp14:anchorId="026529FF" wp14:editId="7E08BF4D">
             <wp:extent cx="5940425" cy="2933065"/>
@@ -2672,7 +2756,7 @@
           <w:sz w:val="28"/>
         </w:rPr>
       </w:pPr>
-      <w:bookmarkStart w:id="2" w:name="_Toc224726729"/>
+      <w:bookmarkStart w:id="3" w:name="_Toc224726729"/>
       <w:r>
         <w:rPr>
           <w:sz w:val="28"/>
@@ -2680,7 +2764,7 @@
         <w:lastRenderedPageBreak/>
         <w:t>ЗАКЛЮЧЕНИЕ</w:t>
       </w:r>
-      <w:bookmarkEnd w:id="2"/>
+      <w:bookmarkEnd w:id="3"/>
     </w:p>
     <w:p>
       <w:pPr>
@@ -2851,7 +2935,39 @@
           <w:rFonts w:ascii="Times New Roman" w:hAnsi="Times New Roman" w:cs="Times New Roman"/>
           <w:sz w:val="28"/>
         </w:rPr>
-        <w:t xml:space="preserve">были освоены навыки разработки базы данных сайта, дизайн веб-приложений, разработка фронтенда и бэкенда веб-приложений, навыки использования </w:t>
+        <w:t xml:space="preserve">были освоены навыки разработки базы данных сайта, дизайн веб-приложений, разработка </w:t>
+      </w:r>
+      <w:proofErr w:type="spellStart"/>
+      <w:r>
+        <w:rPr>
+          <w:rFonts w:ascii="Times New Roman" w:hAnsi="Times New Roman" w:cs="Times New Roman"/>
+          <w:sz w:val="28"/>
+        </w:rPr>
+        <w:t>фронтенда</w:t>
+      </w:r>
+      <w:proofErr w:type="spellEnd"/>
+      <w:r>
+        <w:rPr>
+          <w:rFonts w:ascii="Times New Roman" w:hAnsi="Times New Roman" w:cs="Times New Roman"/>
+          <w:sz w:val="28"/>
+        </w:rPr>
+        <w:t xml:space="preserve"> и </w:t>
+      </w:r>
+      <w:proofErr w:type="spellStart"/>
+      <w:r>
+        <w:rPr>
+          <w:rFonts w:ascii="Times New Roman" w:hAnsi="Times New Roman" w:cs="Times New Roman"/>
+          <w:sz w:val="28"/>
+        </w:rPr>
+        <w:t>бэкенда</w:t>
+      </w:r>
+      <w:proofErr w:type="spellEnd"/>
+      <w:r>
+        <w:rPr>
+          <w:rFonts w:ascii="Times New Roman" w:hAnsi="Times New Roman" w:cs="Times New Roman"/>
+          <w:sz w:val="28"/>
+        </w:rPr>
+        <w:t xml:space="preserve"> веб-приложений, навыки использования </w:t>
       </w:r>
       <w:r>
         <w:rPr>
@@ -2933,7 +3049,23 @@
           <w:rFonts w:ascii="Times New Roman" w:hAnsi="Times New Roman" w:cs="Times New Roman"/>
           <w:sz w:val="28"/>
         </w:rPr>
-        <w:t xml:space="preserve">и навыки разработки на фреймворке </w:t>
+        <w:t xml:space="preserve">и навыки разработки на </w:t>
+      </w:r>
+      <w:proofErr w:type="spellStart"/>
+      <w:r>
+        <w:rPr>
+          <w:rFonts w:ascii="Times New Roman" w:hAnsi="Times New Roman" w:cs="Times New Roman"/>
+          <w:sz w:val="28"/>
+        </w:rPr>
+        <w:t>фреймворке</w:t>
+      </w:r>
+      <w:proofErr w:type="spellEnd"/>
+      <w:r>
+        <w:rPr>
+          <w:rFonts w:ascii="Times New Roman" w:hAnsi="Times New Roman" w:cs="Times New Roman"/>
+          <w:sz w:val="28"/>
+        </w:rPr>
+        <w:t xml:space="preserve"> </w:t>
       </w:r>
       <w:r>
         <w:rPr>
@@ -2942,6 +3074,7 @@
         </w:rPr>
         <w:t>“</w:t>
       </w:r>
+      <w:proofErr w:type="spellStart"/>
       <w:r>
         <w:rPr>
           <w:rFonts w:ascii="Times New Roman" w:hAnsi="Times New Roman" w:cs="Times New Roman"/>
@@ -2950,6 +3083,7 @@
         </w:rPr>
         <w:t>Yii</w:t>
       </w:r>
+      <w:proofErr w:type="spellEnd"/>
       <w:r>
         <w:rPr>
           <w:rFonts w:ascii="Times New Roman" w:hAnsi="Times New Roman" w:cs="Times New Roman"/>
@@ -3035,8 +3169,8 @@
           <w:szCs w:val="28"/>
         </w:rPr>
       </w:pPr>
-      <w:bookmarkStart w:id="3" w:name="_Toc161611545"/>
-      <w:bookmarkStart w:id="4" w:name="_Toc224726730"/>
+      <w:bookmarkStart w:id="4" w:name="_Toc161611545"/>
+      <w:bookmarkStart w:id="5" w:name="_Toc224726730"/>
       <w:r>
         <w:rPr>
           <w:rFonts w:eastAsiaTheme="majorEastAsia"/>
@@ -3046,8 +3180,8 @@
         <w:lastRenderedPageBreak/>
         <w:t>СПИСОК ИСПОЛЬЗОВАННЫХ ИСТОЧНИКОВ</w:t>
       </w:r>
-      <w:bookmarkEnd w:id="3"/>
       <w:bookmarkEnd w:id="4"/>
+      <w:bookmarkEnd w:id="5"/>
     </w:p>
     <w:p>
       <w:hyperlink r:id="rId38" w:history="1">
@@ -3089,6 +3223,7 @@
           </w:rPr>
           <w:t>.</w:t>
         </w:r>
+        <w:proofErr w:type="spellStart"/>
         <w:r>
           <w:rPr>
             <w:rStyle w:val="a4"/>
@@ -3099,6 +3234,7 @@
           </w:rPr>
           <w:t>yiiframework</w:t>
         </w:r>
+        <w:proofErr w:type="spellEnd"/>
         <w:r>
           <w:rPr>
             <w:rStyle w:val="a4"/>
@@ -3132,8 +3268,13 @@
         <w:t xml:space="preserve"> - </w:t>
       </w:r>
       <w:r>
-        <w:t>официальный сайт фреймворка</w:t>
-      </w:r>
+        <w:t xml:space="preserve">официальный сайт </w:t>
+      </w:r>
+      <w:proofErr w:type="spellStart"/>
+      <w:r>
+        <w:t>фреймворка</w:t>
+      </w:r>
+      <w:proofErr w:type="spellEnd"/>
     </w:p>
     <w:p>
       <w:hyperlink r:id="rId39" w:history="1">
@@ -3175,6 +3316,7 @@
           </w:rPr>
           <w:t>.</w:t>
         </w:r>
+        <w:proofErr w:type="spellStart"/>
         <w:r>
           <w:rPr>
             <w:rStyle w:val="a4"/>
@@ -3185,6 +3327,7 @@
           </w:rPr>
           <w:t>phpmyadmin</w:t>
         </w:r>
+        <w:proofErr w:type="spellEnd"/>
         <w:r>
           <w:rPr>
             <w:rStyle w:val="a4"/>
@@ -3242,6 +3385,7 @@
           </w:rPr>
           <w:t>://</w:t>
         </w:r>
+        <w:proofErr w:type="spellStart"/>
         <w:r>
           <w:rPr>
             <w:rStyle w:val="a4"/>
@@ -3252,6 +3396,7 @@
           </w:rPr>
           <w:t>github</w:t>
         </w:r>
+        <w:proofErr w:type="spellEnd"/>
         <w:r>
           <w:rPr>
             <w:rStyle w:val="a4"/>
@@ -3309,6 +3454,7 @@
           </w:rPr>
           <w:t>://</w:t>
         </w:r>
+        <w:proofErr w:type="spellStart"/>
         <w:r>
           <w:rPr>
             <w:rStyle w:val="a4"/>
@@ -3319,6 +3465,7 @@
           </w:rPr>
           <w:t>ospanel</w:t>
         </w:r>
+        <w:proofErr w:type="spellEnd"/>
         <w:r>
           <w:rPr>
             <w:rStyle w:val="a4"/>
@@ -3328,6 +3475,7 @@
           </w:rPr>
           <w:t>.</w:t>
         </w:r>
+        <w:proofErr w:type="spellStart"/>
         <w:r>
           <w:rPr>
             <w:rStyle w:val="a4"/>
@@ -3338,6 +3486,7 @@
           </w:rPr>
           <w:t>io</w:t>
         </w:r>
+        <w:proofErr w:type="spellEnd"/>
         <w:r>
           <w:rPr>
             <w:rStyle w:val="a4"/>
@@ -3430,11 +3579,8 @@
         <w:rPr>
           <w:rFonts w:ascii="Times New Roman" w:hAnsi="Times New Roman" w:cs="Times New Roman"/>
           <w:sz w:val="28"/>
-          <w:lang w:val="en-US"/>
-        </w:rPr>
-      </w:pPr>
-      <w:bookmarkStart w:id="5" w:name="_GoBack"/>
-      <w:bookmarkEnd w:id="5"/>
+        </w:rPr>
+      </w:pPr>
     </w:p>
     <w:p>
       <w:pPr>
@@ -3547,7 +3693,7 @@
             <w:noProof/>
             <w:sz w:val="28"/>
           </w:rPr>
-          <w:t>21</w:t>
+          <w:t>10</w:t>
         </w:r>
         <w:r>
           <w:rPr>
@@ -6895,7 +7041,7 @@
 </file>
 
 <file path=customXml/itemProps1.xml><?xml version="1.0" encoding="utf-8"?>
-<ds:datastoreItem xmlns:ds="http://schemas.openxmlformats.org/officeDocument/2006/customXml" ds:itemID="{45000339-0956-4B9F-9307-9B739CEB783A}">
+<ds:datastoreItem xmlns:ds="http://schemas.openxmlformats.org/officeDocument/2006/customXml" ds:itemID="{4519BA0B-38B6-4259-B878-3CC9CB1502FF}">
   <ds:schemaRefs>
     <ds:schemaRef ds:uri="http://schemas.openxmlformats.org/officeDocument/2006/bibliography"/>
   </ds:schemaRefs>

</xml_diff>